<commit_message>
Shifter Register, map's popup, CAN-bus  updates
</commit_message>
<xml_diff>
--- a/Display_Software_Spec.docx
+++ b/Display_Software_Spec.docx
@@ -5257,7 +5257,7 @@
           <w:noProof/>
         </w:rPr>
         <w:drawing>
-          <wp:anchor distT="0" distB="0" distL="114300" distR="114300" simplePos="0" relativeHeight="251658240" behindDoc="0" locked="0" layoutInCell="1" allowOverlap="1" wp14:anchorId="4AA17CD2" wp14:editId="6C46302E">
+          <wp:anchor distT="0" distB="0" distL="114300" distR="114300" simplePos="0" relativeHeight="251658240" behindDoc="0" locked="0" layoutInCell="1" allowOverlap="1" wp14:anchorId="4AA17CD2" wp14:editId="5C420C01">
             <wp:simplePos x="0" y="0"/>
             <wp:positionH relativeFrom="margin">
               <wp:align>left</wp:align>
@@ -5265,8 +5265,8 @@
             <wp:positionV relativeFrom="paragraph">
               <wp:posOffset>527050</wp:posOffset>
             </wp:positionV>
-            <wp:extent cx="1918290" cy="2880000"/>
-            <wp:effectExtent l="0" t="0" r="6350" b="0"/>
+            <wp:extent cx="1678504" cy="2520000"/>
+            <wp:effectExtent l="0" t="0" r="0" b="0"/>
             <wp:wrapTopAndBottom/>
             <wp:docPr id="1309206966" name="Immagine 2" descr="Immagine che contiene testo, schermata, Carattere, Elementi grafici&#10;&#10;Descrizione generata automaticamente"/>
             <wp:cNvGraphicFramePr>
@@ -5297,7 +5297,7 @@
                   <pic:spPr bwMode="auto">
                     <a:xfrm>
                       <a:off x="0" y="0"/>
-                      <a:ext cx="1918290" cy="2880000"/>
+                      <a:ext cx="1678504" cy="2520000"/>
                     </a:xfrm>
                     <a:prstGeom prst="rect">
                       <a:avLst/>
@@ -5348,16 +5348,16 @@
           <w:noProof/>
         </w:rPr>
         <w:drawing>
-          <wp:anchor distT="0" distB="0" distL="114300" distR="114300" simplePos="0" relativeHeight="251659264" behindDoc="0" locked="0" layoutInCell="1" allowOverlap="1" wp14:anchorId="05EF5BCD" wp14:editId="55105C71">
+          <wp:anchor distT="0" distB="0" distL="114300" distR="114300" simplePos="0" relativeHeight="251659264" behindDoc="0" locked="0" layoutInCell="1" allowOverlap="1" wp14:anchorId="05EF5BCD" wp14:editId="70937DDA">
             <wp:simplePos x="0" y="0"/>
             <wp:positionH relativeFrom="column">
               <wp:posOffset>1963420</wp:posOffset>
             </wp:positionH>
             <wp:positionV relativeFrom="paragraph">
-              <wp:posOffset>324154</wp:posOffset>
+              <wp:posOffset>323850</wp:posOffset>
             </wp:positionV>
-            <wp:extent cx="1917669" cy="2880000"/>
-            <wp:effectExtent l="0" t="0" r="6985" b="0"/>
+            <wp:extent cx="1677960" cy="2520000"/>
+            <wp:effectExtent l="0" t="0" r="0" b="0"/>
             <wp:wrapTopAndBottom/>
             <wp:docPr id="1653718139" name="Immagine 3" descr="Immagine che contiene testo, schermata, Carattere, numero&#10;&#10;Descrizione generata automaticamente"/>
             <wp:cNvGraphicFramePr>
@@ -5388,7 +5388,7 @@
                   <pic:spPr bwMode="auto">
                     <a:xfrm>
                       <a:off x="0" y="0"/>
-                      <a:ext cx="1917669" cy="2880000"/>
+                      <a:ext cx="1677960" cy="2520000"/>
                     </a:xfrm>
                     <a:prstGeom prst="rect">
                       <a:avLst/>
@@ -5469,9 +5469,403 @@
         <w:tab/>
       </w:r>
     </w:p>
+    <w:p>
+      <w:pPr>
+        <w:rPr>
+          <w:lang w:val="it-IT"/>
+        </w:rPr>
+      </w:pPr>
+      <w:r>
+        <w:rPr>
+          <w:lang w:val="it-IT"/>
+        </w:rPr>
+        <w:t>05/12/24 – Alessandro Zingaretti</w:t>
+      </w:r>
+    </w:p>
+    <w:p>
+      <w:pPr>
+        <w:rPr>
+          <w:lang w:val="it-IT"/>
+        </w:rPr>
+      </w:pPr>
+      <w:r>
+        <w:rPr>
+          <w:lang w:val="it-IT"/>
+        </w:rPr>
+        <w:t>(Fare riferimento al link GitHub sopra riportato)</w:t>
+      </w:r>
+    </w:p>
+    <w:p>
+      <w:pPr>
+        <w:pStyle w:val="Paragrafoelenco"/>
+        <w:numPr>
+          <w:ilvl w:val="0"/>
+          <w:numId w:val="13"/>
+        </w:numPr>
+        <w:rPr>
+          <w:lang w:val="it-IT"/>
+        </w:rPr>
+      </w:pPr>
+      <w:r>
+        <w:rPr>
+          <w:lang w:val="it-IT"/>
+        </w:rPr>
+        <w:t xml:space="preserve">Creata, ma </w:t>
+      </w:r>
+      <w:r>
+        <w:rPr>
+          <w:u w:val="single"/>
+          <w:lang w:val="it-IT"/>
+        </w:rPr>
+        <w:t>non implementata</w:t>
+      </w:r>
+      <w:r>
+        <w:rPr>
+          <w:lang w:val="it-IT"/>
+        </w:rPr>
+        <w:t>, un popup di qualche secondo relativo ad un cambio di mappa che apparirà sullo schermo (vedi prima immagine).</w:t>
+      </w:r>
+    </w:p>
+    <w:p>
+      <w:pPr>
+        <w:pStyle w:val="Paragrafoelenco"/>
+        <w:numPr>
+          <w:ilvl w:val="0"/>
+          <w:numId w:val="13"/>
+        </w:numPr>
+        <w:rPr>
+          <w:lang w:val="it-IT"/>
+        </w:rPr>
+      </w:pPr>
+      <w:r>
+        <w:rPr>
+          <w:lang w:val="it-IT"/>
+        </w:rPr>
+        <w:t>Risolto il funzionamento del pulsan</w:t>
+      </w:r>
+      <w:r>
+        <w:rPr>
+          <w:lang w:val="it-IT"/>
+        </w:rPr>
+        <w:t>t</w:t>
+      </w:r>
+      <w:r>
+        <w:rPr>
+          <w:lang w:val="it-IT"/>
+        </w:rPr>
+        <w:t>e per il cambio di pagina del display (nome</w:t>
+      </w:r>
+      <w:proofErr w:type="gramStart"/>
+      <w:r>
+        <w:rPr>
+          <w:lang w:val="it-IT"/>
+        </w:rPr>
+        <w:t>:</w:t>
+      </w:r>
+      <w:r>
+        <w:rPr>
+          <w:lang w:val="it-IT"/>
+        </w:rPr>
+        <w:t>”</w:t>
+      </w:r>
+      <w:proofErr w:type="spellStart"/>
+      <w:r>
+        <w:rPr>
+          <w:lang w:val="it-IT"/>
+        </w:rPr>
+        <w:t>nextPage</w:t>
+      </w:r>
+      <w:r>
+        <w:rPr>
+          <w:lang w:val="it-IT"/>
+        </w:rPr>
+        <w:t>Button</w:t>
+      </w:r>
+      <w:proofErr w:type="spellEnd"/>
+      <w:proofErr w:type="gramEnd"/>
+      <w:r>
+        <w:rPr>
+          <w:lang w:val="it-IT"/>
+        </w:rPr>
+        <w:t>”, PA5, impostato come “</w:t>
+      </w:r>
+      <w:proofErr w:type="spellStart"/>
+      <w:r>
+        <w:rPr>
+          <w:lang w:val="it-IT"/>
+        </w:rPr>
+        <w:t>External</w:t>
+      </w:r>
+      <w:proofErr w:type="spellEnd"/>
+      <w:r>
+        <w:rPr>
+          <w:lang w:val="it-IT"/>
+        </w:rPr>
+        <w:t xml:space="preserve"> Interrupt in </w:t>
+      </w:r>
+      <w:proofErr w:type="spellStart"/>
+      <w:r>
+        <w:rPr>
+          <w:lang w:val="it-IT"/>
+        </w:rPr>
+        <w:t>Falling</w:t>
+      </w:r>
+      <w:proofErr w:type="spellEnd"/>
+      <w:r>
+        <w:rPr>
+          <w:lang w:val="it-IT"/>
+        </w:rPr>
+        <w:t>”, circuito in Pull Up)</w:t>
+      </w:r>
+    </w:p>
+    <w:p>
+      <w:pPr>
+        <w:pStyle w:val="Paragrafoelenco"/>
+        <w:numPr>
+          <w:ilvl w:val="0"/>
+          <w:numId w:val="13"/>
+        </w:numPr>
+        <w:rPr>
+          <w:lang w:val="it-IT"/>
+        </w:rPr>
+      </w:pPr>
+      <w:r>
+        <w:rPr>
+          <w:noProof/>
+          <w:lang w:val="it-IT"/>
+        </w:rPr>
+        <w:drawing>
+          <wp:anchor distT="0" distB="0" distL="114300" distR="114300" simplePos="0" relativeHeight="251661312" behindDoc="0" locked="0" layoutInCell="1" allowOverlap="1" wp14:anchorId="42B180FB" wp14:editId="340BA13D">
+            <wp:simplePos x="0" y="0"/>
+            <wp:positionH relativeFrom="margin">
+              <wp:posOffset>4174921</wp:posOffset>
+            </wp:positionH>
+            <wp:positionV relativeFrom="paragraph">
+              <wp:posOffset>295850</wp:posOffset>
+            </wp:positionV>
+            <wp:extent cx="1772920" cy="2667635"/>
+            <wp:effectExtent l="0" t="0" r="0" b="0"/>
+            <wp:wrapThrough wrapText="bothSides">
+              <wp:wrapPolygon edited="0">
+                <wp:start x="0" y="0"/>
+                <wp:lineTo x="0" y="21441"/>
+                <wp:lineTo x="21352" y="21441"/>
+                <wp:lineTo x="21352" y="0"/>
+                <wp:lineTo x="0" y="0"/>
+              </wp:wrapPolygon>
+            </wp:wrapThrough>
+            <wp:docPr id="323100384" name="Immagine 3" descr="Immagine che contiene testo, schermata, Carattere, Elementi grafici&#10;&#10;Descrizione generata automaticamente"/>
+            <wp:cNvGraphicFramePr>
+              <a:graphicFrameLocks xmlns:a="http://schemas.openxmlformats.org/drawingml/2006/main" noChangeAspect="1"/>
+            </wp:cNvGraphicFramePr>
+            <a:graphic xmlns:a="http://schemas.openxmlformats.org/drawingml/2006/main">
+              <a:graphicData uri="http://schemas.openxmlformats.org/drawingml/2006/picture">
+                <pic:pic xmlns:pic="http://schemas.openxmlformats.org/drawingml/2006/picture">
+                  <pic:nvPicPr>
+                    <pic:cNvPr id="323100384" name="Immagine 3" descr="Immagine che contiene testo, schermata, Carattere, Elementi grafici&#10;&#10;Descrizione generata automaticamente"/>
+                    <pic:cNvPicPr>
+                      <a:picLocks noChangeAspect="1" noChangeArrowheads="1"/>
+                    </pic:cNvPicPr>
+                  </pic:nvPicPr>
+                  <pic:blipFill>
+                    <a:blip r:embed="rId15">
+                      <a:extLst>
+                        <a:ext uri="{28A0092B-C50C-407E-A947-70E740481C1C}">
+                          <a14:useLocalDpi xmlns:a14="http://schemas.microsoft.com/office/drawing/2010/main" val="0"/>
+                        </a:ext>
+                      </a:extLst>
+                    </a:blip>
+                    <a:srcRect/>
+                    <a:stretch>
+                      <a:fillRect/>
+                    </a:stretch>
+                  </pic:blipFill>
+                  <pic:spPr bwMode="auto">
+                    <a:xfrm>
+                      <a:off x="0" y="0"/>
+                      <a:ext cx="1772920" cy="2667635"/>
+                    </a:xfrm>
+                    <a:prstGeom prst="rect">
+                      <a:avLst/>
+                    </a:prstGeom>
+                    <a:noFill/>
+                    <a:ln>
+                      <a:noFill/>
+                    </a:ln>
+                  </pic:spPr>
+                </pic:pic>
+              </a:graphicData>
+            </a:graphic>
+            <wp14:sizeRelH relativeFrom="margin">
+              <wp14:pctWidth>0</wp14:pctWidth>
+            </wp14:sizeRelH>
+            <wp14:sizeRelV relativeFrom="margin">
+              <wp14:pctHeight>0</wp14:pctHeight>
+            </wp14:sizeRelV>
+          </wp:anchor>
+        </w:drawing>
+      </w:r>
+      <w:r>
+        <w:rPr>
+          <w:lang w:val="it-IT"/>
+        </w:rPr>
+        <w:t>Non ancora risolto del tutto il funzionamento del pulsante per l’attivazione del r2d (nome</w:t>
+      </w:r>
+      <w:proofErr w:type="gramStart"/>
+      <w:r>
+        <w:rPr>
+          <w:lang w:val="it-IT"/>
+        </w:rPr>
+        <w:t>:”r</w:t>
+      </w:r>
+      <w:proofErr w:type="gramEnd"/>
+      <w:r>
+        <w:rPr>
+          <w:lang w:val="it-IT"/>
+        </w:rPr>
+        <w:t>2dButton”, PA4, impostato come “</w:t>
+      </w:r>
+      <w:proofErr w:type="spellStart"/>
+      <w:r>
+        <w:rPr>
+          <w:lang w:val="it-IT"/>
+        </w:rPr>
+        <w:t>External</w:t>
+      </w:r>
+      <w:proofErr w:type="spellEnd"/>
+      <w:r>
+        <w:rPr>
+          <w:lang w:val="it-IT"/>
+        </w:rPr>
+        <w:t xml:space="preserve"> Interrupt in </w:t>
+      </w:r>
+      <w:proofErr w:type="spellStart"/>
+      <w:r>
+        <w:rPr>
+          <w:lang w:val="it-IT"/>
+        </w:rPr>
+        <w:t>Falling</w:t>
+      </w:r>
+      <w:proofErr w:type="spellEnd"/>
+      <w:r>
+        <w:rPr>
+          <w:lang w:val="it-IT"/>
+        </w:rPr>
+        <w:t>”, circuito in Pull up). Ora non avvengono più doppie chiamate qualora lo si prema, ma è possibile invece che “salti” qualche chiamata.</w:t>
+      </w:r>
+    </w:p>
+    <w:p>
+      <w:pPr>
+        <w:pStyle w:val="Paragrafoelenco"/>
+        <w:numPr>
+          <w:ilvl w:val="0"/>
+          <w:numId w:val="13"/>
+        </w:numPr>
+        <w:rPr>
+          <w:lang w:val="it-IT"/>
+        </w:rPr>
+      </w:pPr>
+      <w:r>
+        <w:rPr>
+          <w:lang w:val="it-IT"/>
+        </w:rPr>
+        <w:t xml:space="preserve">Implementata ma </w:t>
+      </w:r>
+      <w:r>
+        <w:rPr>
+          <w:u w:val="single"/>
+          <w:lang w:val="it-IT"/>
+        </w:rPr>
+        <w:t>non testata</w:t>
+      </w:r>
+      <w:r>
+        <w:rPr>
+          <w:lang w:val="it-IT"/>
+        </w:rPr>
+        <w:t>, una libreria per il funzionamento dello shift resister</w:t>
+      </w:r>
+    </w:p>
+    <w:p>
+      <w:pPr>
+        <w:pStyle w:val="Paragrafoelenco"/>
+        <w:numPr>
+          <w:ilvl w:val="0"/>
+          <w:numId w:val="13"/>
+        </w:numPr>
+        <w:rPr>
+          <w:u w:val="single"/>
+          <w:lang w:val="it-IT"/>
+        </w:rPr>
+      </w:pPr>
+      <w:r>
+        <w:rPr>
+          <w:u w:val="single"/>
+          <w:lang w:val="it-IT"/>
+        </w:rPr>
+        <w:t>Da rivedere</w:t>
+      </w:r>
+      <w:r>
+        <w:rPr>
+          <w:u w:val="single"/>
+          <w:lang w:val="it-IT"/>
+        </w:rPr>
+        <w:t>,</w:t>
+      </w:r>
+      <w:r>
+        <w:rPr>
+          <w:lang w:val="it-IT"/>
+        </w:rPr>
+        <w:t xml:space="preserve"> la libreria per l’utilizzo della rete CAN-BUS.</w:t>
+      </w:r>
+    </w:p>
+    <w:p>
+      <w:pPr>
+        <w:rPr>
+          <w:lang w:val="it-IT"/>
+        </w:rPr>
+      </w:pPr>
+      <w:r>
+        <w:rPr>
+          <w:lang w:val="it-IT"/>
+        </w:rPr>
+        <w:t xml:space="preserve">In generale bisognerebbe rivedere lo schematico del volante per chiarire alcuni dubbi, come i circuiti dei pulsanti e le porte relative allo shift </w:t>
+      </w:r>
+      <w:proofErr w:type="spellStart"/>
+      <w:r>
+        <w:rPr>
+          <w:lang w:val="it-IT"/>
+        </w:rPr>
+        <w:t>register</w:t>
+      </w:r>
+      <w:proofErr w:type="spellEnd"/>
+      <w:r>
+        <w:rPr>
+          <w:lang w:val="it-IT"/>
+        </w:rPr>
+        <w:t xml:space="preserve"> (riportate due volte). </w:t>
+      </w:r>
+    </w:p>
+    <w:p>
+      <w:pPr>
+        <w:pBdr>
+          <w:top w:val="nil"/>
+          <w:left w:val="nil"/>
+          <w:bottom w:val="nil"/>
+          <w:right w:val="nil"/>
+          <w:between w:val="nil"/>
+        </w:pBdr>
+        <w:spacing w:line="240" w:lineRule="auto"/>
+        <w:rPr>
+          <w:rFonts w:asciiTheme="majorHAnsi" w:hAnsiTheme="majorHAnsi" w:cstheme="majorHAnsi"/>
+          <w:sz w:val="24"/>
+          <w:szCs w:val="24"/>
+          <w:lang w:val="it-IT"/>
+        </w:rPr>
+      </w:pPr>
+    </w:p>
     <w:sectPr>
-      <w:headerReference w:type="default" r:id="rId15"/>
-      <w:footerReference w:type="default" r:id="rId16"/>
+      <w:headerReference w:type="default" r:id="rId16"/>
+      <w:footerReference w:type="default" r:id="rId17"/>
       <w:pgSz w:w="12240" w:h="15840"/>
       <w:pgMar w:top="1440" w:right="1440" w:bottom="1440" w:left="1440" w:header="567" w:footer="567" w:gutter="0"/>
       <w:pgNumType w:start="1"/>
@@ -5724,7 +6118,7 @@
                 <w:szCs w:val="24"/>
                 <w:lang w:val="en-GB"/>
               </w:rPr>
-              <w:t>29/11/2024</w:t>
+              <w:t>06/12/2024</w:t>
             </w:r>
             <w:r>
               <w:rPr>
@@ -8708,10 +9102,6 @@
 </file>
 
 <file path=customXml/item1.xml><?xml version="1.0" encoding="utf-8"?>
-<b:Sources xmlns:b="http://schemas.openxmlformats.org/officeDocument/2006/bibliography" xmlns="http://schemas.openxmlformats.org/officeDocument/2006/bibliography" SelectedStyle="\APASixthEditionOfficeOnline.xsl" StyleName="APA" Version="6"/>
-</file>
-
-<file path=customXml/item2.xml><?xml version="1.0" encoding="utf-8"?>
 <?mso-contentType ?>
 <FormTemplates xmlns="http://schemas.microsoft.com/sharepoint/v3/contenttype/forms">
   <Display>DocumentLibraryForm</Display>
@@ -8720,7 +9110,7 @@
 </FormTemplates>
 </file>
 
-<file path=customXml/item3.xml><?xml version="1.0" encoding="utf-8"?>
+<file path=customXml/item2.xml><?xml version="1.0" encoding="utf-8"?>
 <p:properties xmlns:p="http://schemas.microsoft.com/office/2006/metadata/properties" xmlns:xsi="http://www.w3.org/2001/XMLSchema-instance" xmlns:pc="http://schemas.microsoft.com/office/infopath/2007/PartnerControls">
   <documentManagement>
     <lcf76f155ced4ddcb4097134ff3c332f xmlns="ff5a5868-af0a-410c-839e-8d12f9bbae36">
@@ -8730,7 +9120,7 @@
 </p:properties>
 </file>
 
-<file path=customXml/item4.xml><?xml version="1.0" encoding="utf-8"?>
+<file path=customXml/item3.xml><?xml version="1.0" encoding="utf-8"?>
 <ct:contentTypeSchema xmlns:ct="http://schemas.microsoft.com/office/2006/metadata/contentType" xmlns:ma="http://schemas.microsoft.com/office/2006/metadata/properties/metaAttributes" ct:_="" ma:_="" ma:contentTypeName="Documento" ma:contentTypeID="0x010100B21CAF5201C82C43AA4DBD7D4A985E69" ma:contentTypeVersion="17" ma:contentTypeDescription="Creare un nuovo documento." ma:contentTypeScope="" ma:versionID="211c33d4d86005f0f0267f50b4ae0a4c">
   <xsd:schema xmlns:xsd="http://www.w3.org/2001/XMLSchema" xmlns:xs="http://www.w3.org/2001/XMLSchema" xmlns:p="http://schemas.microsoft.com/office/2006/metadata/properties" xmlns:ns2="ff5a5868-af0a-410c-839e-8d12f9bbae36" xmlns:ns3="4e4aeb4f-2755-45de-8429-e3c3045be2d4" targetNamespace="http://schemas.microsoft.com/office/2006/metadata/properties" ma:root="true" ma:fieldsID="0154d882b59d2c50fc4179a4b74a9d7b" ns2:_="" ns3:_="">
     <xsd:import namespace="ff5a5868-af0a-410c-839e-8d12f9bbae36"/>
@@ -8973,15 +9363,11 @@
 </ct:contentTypeSchema>
 </file>
 
-<file path=customXml/itemProps1.xml><?xml version="1.0" encoding="utf-8"?>
-<ds:datastoreItem xmlns:ds="http://schemas.openxmlformats.org/officeDocument/2006/customXml" ds:itemID="{7B1F568D-5C8C-4DD2-AF51-0F492A817DDC}">
-  <ds:schemaRefs>
-    <ds:schemaRef ds:uri="http://schemas.openxmlformats.org/officeDocument/2006/bibliography"/>
-  </ds:schemaRefs>
-</ds:datastoreItem>
+<file path=customXml/item4.xml><?xml version="1.0" encoding="utf-8"?>
+<b:Sources xmlns:b="http://schemas.openxmlformats.org/officeDocument/2006/bibliography" xmlns="http://schemas.openxmlformats.org/officeDocument/2006/bibliography" SelectedStyle="\APASixthEditionOfficeOnline.xsl" StyleName="APA" Version="6"/>
 </file>
 
-<file path=customXml/itemProps2.xml><?xml version="1.0" encoding="utf-8"?>
+<file path=customXml/itemProps1.xml><?xml version="1.0" encoding="utf-8"?>
 <ds:datastoreItem xmlns:ds="http://schemas.openxmlformats.org/officeDocument/2006/customXml" ds:itemID="{B5E9EA25-5FC5-4B77-9A98-9B7CEE936CAC}">
   <ds:schemaRefs>
     <ds:schemaRef ds:uri="http://schemas.microsoft.com/sharepoint/v3/contenttype/forms"/>
@@ -8989,7 +9375,7 @@
 </ds:datastoreItem>
 </file>
 
-<file path=customXml/itemProps3.xml><?xml version="1.0" encoding="utf-8"?>
+<file path=customXml/itemProps2.xml><?xml version="1.0" encoding="utf-8"?>
 <ds:datastoreItem xmlns:ds="http://schemas.openxmlformats.org/officeDocument/2006/customXml" ds:itemID="{515A2476-6CCC-4ACD-8B23-92066FF69FF5}">
   <ds:schemaRefs>
     <ds:schemaRef ds:uri="http://schemas.microsoft.com/office/2006/metadata/properties"/>
@@ -8999,7 +9385,7 @@
 </ds:datastoreItem>
 </file>
 
-<file path=customXml/itemProps4.xml><?xml version="1.0" encoding="utf-8"?>
+<file path=customXml/itemProps3.xml><?xml version="1.0" encoding="utf-8"?>
 <ds:datastoreItem xmlns:ds="http://schemas.openxmlformats.org/officeDocument/2006/customXml" ds:itemID="{0F72BB7A-F5EE-4280-AA5C-33D1598D8DE1}">
   <ds:schemaRefs>
     <ds:schemaRef ds:uri="http://schemas.microsoft.com/office/2006/metadata/contentType"/>
@@ -9016,4 +9402,12 @@
     <ds:schemaRef ds:uri="http://schemas.microsoft.com/internal/obd"/>
   </ds:schemaRefs>
 </ds:datastoreItem>
+</file>
+
+<file path=customXml/itemProps4.xml><?xml version="1.0" encoding="utf-8"?>
+<ds:datastoreItem xmlns:ds="http://schemas.openxmlformats.org/officeDocument/2006/customXml" ds:itemID="{7B1F568D-5C8C-4DD2-AF51-0F492A817DDC}">
+  <ds:schemaRefs>
+    <ds:schemaRef ds:uri="http://schemas.openxmlformats.org/officeDocument/2006/bibliography"/>
+  </ds:schemaRefs>
+</ds:datastoreItem>
 </file>
</xml_diff>